<commit_message>
Proposals refreshed to the current manuscript; MIT Press package added
Corrections across all packages: Stata Press address (editor@, not service@),
336pp / ~158,000 words / 67 figures, and five appendices including the
30-page reproducible capstone that every package had omitted. Chapter 6
entries now carry the ecosystem capstone; the pitch foregrounds the
workflow argument as an extension of Long. Sample chapters changed to
1/2/6/13 (Vernon: ch6 alone). The three FILLED.docx/.pdf attachments were
regenerated from the corrected text -- they still carried every stale
number. New MIT_Press/ package: two-stage inquiry, ready-to-send email to
Catherine Woods, and an if-invited checklist.
</commit_message>
<xml_diff>
--- a/LaTeXBookCode/PublicationProposal/Anthem_Press/Booth_Teas_AnthemPress_proposal_FILLED.docx
+++ b/LaTeXBookCode/PublicationProposal/Anthem_Press/Booth_Teas_AnthemPress_proposal_FILLED.docx
@@ -2,118 +2,43 @@
 <file path=word/document.xml><?xml version="1.0" encoding="utf-8"?>
 <w:document xmlns:w="http://schemas.openxmlformats.org/wordprocessingml/2006/main" xmlns:m="http://schemas.openxmlformats.org/officeDocument/2006/math" xmlns:r="http://schemas.openxmlformats.org/officeDocument/2006/relationships" xmlns:o="urn:schemas-microsoft-com:office:office" xmlns:v="urn:schemas-microsoft-com:vml" xmlns:w10="urn:schemas-microsoft-com:office:word" xmlns:a="http://schemas.openxmlformats.org/drawingml/2006/main" xmlns:pic="http://schemas.openxmlformats.org/drawingml/2006/picture" xmlns:wp="http://schemas.openxmlformats.org/drawingml/2006/wordprocessingDrawing">
   <w:body>
-    <w:p>
-      <w:pPr>
-        <w:pStyle w:val="Title"/>
-      </w:pPr>
-      <w:r>
-        <w:t xml:space="preserve">Publishing</w:t>
-      </w:r>
-      <w:r>
-        <w:t xml:space="preserve"> </w:t>
-      </w:r>
-      <w:r>
-        <w:t xml:space="preserve">Proposal</w:t>
-      </w:r>
-      <w:r>
-        <w:t xml:space="preserve"> </w:t>
-      </w:r>
-      <w:r>
-        <w:t xml:space="preserve">Form:</w:t>
-      </w:r>
-      <w:r>
-        <w:t xml:space="preserve"> </w:t>
-      </w:r>
-      <w:r>
-        <w:t xml:space="preserve">Applied</w:t>
-      </w:r>
-      <w:r>
-        <w:t xml:space="preserve"> </w:t>
-      </w:r>
-      <w:r>
-        <w:t xml:space="preserve">Program</w:t>
-      </w:r>
-      <w:r>
-        <w:t xml:space="preserve"> </w:t>
-      </w:r>
-      <w:r>
-        <w:t xml:space="preserve">Evaluation</w:t>
-      </w:r>
-      <w:r>
-        <w:t xml:space="preserve"> </w:t>
-      </w:r>
-      <w:r>
-        <w:t xml:space="preserve">Using</w:t>
-      </w:r>
-      <w:r>
-        <w:t xml:space="preserve"> </w:t>
-      </w:r>
-      <w:r>
-        <w:t xml:space="preserve">Stata</w:t>
-      </w:r>
-    </w:p>
-    <w:p>
-      <w:pPr>
-        <w:pStyle w:val="Author"/>
-      </w:pPr>
-      <w:r>
-        <w:t xml:space="preserve">Eric</w:t>
-      </w:r>
-      <w:r>
-        <w:t xml:space="preserve"> </w:t>
-      </w:r>
-      <w:r>
-        <w:t xml:space="preserve">A.</w:t>
-      </w:r>
-      <w:r>
-        <w:t xml:space="preserve"> </w:t>
-      </w:r>
-      <w:r>
-        <w:t xml:space="preserve">Booth</w:t>
-      </w:r>
-      <w:r>
-        <w:t xml:space="preserve"> </w:t>
-      </w:r>
-      <w:r>
-        <w:t xml:space="preserve">and</w:t>
-      </w:r>
-      <w:r>
-        <w:t xml:space="preserve"> </w:t>
-      </w:r>
-      <w:r>
-        <w:t xml:space="preserve">Elizabeth</w:t>
-      </w:r>
-      <w:r>
-        <w:t xml:space="preserve"> </w:t>
-      </w:r>
-      <w:r>
-        <w:t xml:space="preserve">Teas</w:t>
-      </w:r>
-    </w:p>
-    <w:p>
-      <w:pPr>
-        <w:pStyle w:val="Date"/>
-      </w:pPr>
-      <w:r>
-        <w:t xml:space="preserve">Submitted</w:t>
-      </w:r>
-      <w:r>
-        <w:t xml:space="preserve"> </w:t>
-      </w:r>
-      <w:r>
-        <w:t xml:space="preserve">to</w:t>
-      </w:r>
-      <w:r>
-        <w:t xml:space="preserve"> </w:t>
-      </w:r>
-      <w:r>
-        <w:t xml:space="preserve">Anthem</w:t>
-      </w:r>
-      <w:r>
-        <w:t xml:space="preserve"> </w:t>
-      </w:r>
-      <w:r>
-        <w:t xml:space="preserve">Press</w:t>
+    <w:bookmarkStart w:id="34" w:name="X59bd42505bdf845c80c9f8373736e3f55eb5e2a"/>
+    <w:p>
+      <w:pPr>
+        <w:pStyle w:val="Heading1"/>
+      </w:pPr>
+      <w:r>
+        <w:t xml:space="preserve">Anthem Press proposal form — content to paste</w:t>
+      </w:r>
+    </w:p>
+    <w:p>
+      <w:pPr>
+        <w:pStyle w:val="FirstParagraph"/>
+      </w:pPr>
+      <w:r>
+        <w:t xml:space="preserve">Headings follow</w:t>
+      </w:r>
+      <w:r>
+        <w:t xml:space="preserve"> </w:t>
+      </w:r>
+      <w:r>
+        <w:rPr>
+          <w:rStyle w:val="VerbatimChar"/>
+        </w:rPr>
+        <w:t xml:space="preserve">anthem_press_proposal_form_BLANK.docx</w:t>
+      </w:r>
+      <w:r>
+        <w:t xml:space="preserve"> </w:t>
+      </w:r>
+      <w:r>
+        <w:t xml:space="preserve">in order.</w:t>
+      </w:r>
+    </w:p>
+    <w:p>
+      <w:r>
+        <w:pict>
+          <v:rect style="width:0;height:1.5pt" o:hralign="center" o:hrstd="t" o:hr="t"/>
+        </w:pict>
       </w:r>
     </w:p>
     <w:bookmarkStart w:id="20" w:name="author-editor"/>
@@ -277,10 +202,10 @@
             </w:pPr>
             <w:r>
               <w:rPr>
-                <w:bCs/>
-                <w:b/>
+                <w:iCs/>
+                <w:i/>
               </w:rPr>
-              <w:t xml:space="preserve">[TO COMPLETE]</w:t>
+              <w:t xml:space="preserve">[fill]</w:t>
             </w:r>
           </w:p>
         </w:tc>
@@ -293,10 +218,10 @@
             </w:pPr>
             <w:r>
               <w:rPr>
-                <w:bCs/>
-                <w:b/>
+                <w:iCs/>
+                <w:i/>
               </w:rPr>
-              <w:t xml:space="preserve">[TO COMPLETE]</w:t>
+              <w:t xml:space="preserve">[fill]</w:t>
             </w:r>
           </w:p>
         </w:tc>
@@ -323,10 +248,10 @@
             </w:pPr>
             <w:r>
               <w:rPr>
-                <w:bCs/>
-                <w:b/>
+                <w:iCs/>
+                <w:i/>
               </w:rPr>
-              <w:t xml:space="preserve">[TO COMPLETE]</w:t>
+              <w:t xml:space="preserve">[fill]</w:t>
             </w:r>
           </w:p>
         </w:tc>
@@ -339,10 +264,10 @@
             </w:pPr>
             <w:r>
               <w:rPr>
-                <w:bCs/>
-                <w:b/>
+                <w:iCs/>
+                <w:i/>
               </w:rPr>
-              <w:t xml:space="preserve">[TO COMPLETE]</w:t>
+              <w:t xml:space="preserve">[fill]</w:t>
             </w:r>
           </w:p>
         </w:tc>
@@ -369,10 +294,10 @@
             </w:pPr>
             <w:r>
               <w:rPr>
-                <w:bCs/>
-                <w:b/>
+                <w:iCs/>
+                <w:i/>
               </w:rPr>
-              <w:t xml:space="preserve">[TO COMPLETE]</w:t>
+              <w:t xml:space="preserve">[fill: or leave blank; it is not load-bearing]</w:t>
             </w:r>
           </w:p>
         </w:tc>
@@ -385,10 +310,10 @@
             </w:pPr>
             <w:r>
               <w:rPr>
-                <w:bCs/>
-                <w:b/>
+                <w:iCs/>
+                <w:i/>
               </w:rPr>
-              <w:t xml:space="preserve">[TO COMPLETE]</w:t>
+              <w:t xml:space="preserve">[fill]</w:t>
             </w:r>
           </w:p>
         </w:tc>
@@ -415,10 +340,10 @@
             </w:pPr>
             <w:r>
               <w:rPr>
-                <w:bCs/>
-                <w:b/>
+                <w:iCs/>
+                <w:i/>
               </w:rPr>
-              <w:t xml:space="preserve">[TO COMPLETE]</w:t>
+              <w:t xml:space="preserve">[fill]</w:t>
             </w:r>
           </w:p>
         </w:tc>
@@ -431,10 +356,10 @@
             </w:pPr>
             <w:r>
               <w:rPr>
-                <w:bCs/>
-                <w:b/>
+                <w:iCs/>
+                <w:i/>
               </w:rPr>
-              <w:t xml:space="preserve">[TO COMPLETE]</w:t>
+              <w:t xml:space="preserve">[fill]</w:t>
             </w:r>
           </w:p>
         </w:tc>
@@ -473,10 +398,10 @@
             </w:pPr>
             <w:r>
               <w:rPr>
-                <w:bCs/>
-                <w:b/>
+                <w:iCs/>
+                <w:i/>
               </w:rPr>
-              <w:t xml:space="preserve">[TO COMPLETE]</w:t>
+              <w:t xml:space="preserve">[fill]</w:t>
             </w:r>
           </w:p>
         </w:tc>
@@ -503,10 +428,10 @@
             </w:pPr>
             <w:r>
               <w:rPr>
-                <w:bCs/>
-                <w:b/>
+                <w:iCs/>
+                <w:i/>
               </w:rPr>
-              <w:t xml:space="preserve">[TO COMPLETE: GitHub profile, and LinkedIn or Bluesky if used professionally]</w:t>
+              <w:t xml:space="preserve">[fill: GitHub profile is the relevant one here, plus LinkedIn or Bluesky if used professionally]</w:t>
             </w:r>
           </w:p>
         </w:tc>
@@ -519,10 +444,10 @@
             </w:pPr>
             <w:r>
               <w:rPr>
-                <w:bCs/>
-                <w:b/>
+                <w:iCs/>
+                <w:i/>
               </w:rPr>
-              <w:t xml:space="preserve">[TO COMPLETE]</w:t>
+              <w:t xml:space="preserve">[fill]</w:t>
             </w:r>
           </w:p>
         </w:tc>
@@ -543,7 +468,41 @@
         <w:t xml:space="preserve"> </w:t>
       </w:r>
       <w:r>
-        <w:t xml:space="preserve">attached for both authors.</w:t>
+        <w:t xml:space="preserve">attach both. Note their warning that CVs are shared with reviewers unless you object.</w:t>
+      </w:r>
+    </w:p>
+    <w:p>
+      <w:pPr>
+        <w:pStyle w:val="BodyText"/>
+      </w:pPr>
+      <w:r>
+        <w:rPr>
+          <w:bCs/>
+          <w:b/>
+        </w:rPr>
+        <w:t xml:space="preserve">On the affiliation and address fields.</w:t>
+      </w:r>
+      <w:r>
+        <w:t xml:space="preserve"> </w:t>
+      </w:r>
+      <w:r>
+        <w:t xml:space="preserve">List your current positions, since they establish credibility and the form asks. But use</w:t>
+      </w:r>
+      <w:r>
+        <w:t xml:space="preserve"> </w:t>
+      </w:r>
+      <w:r>
+        <w:rPr>
+          <w:bCs/>
+          <w:b/>
+        </w:rPr>
+        <w:t xml:space="preserve">personal</w:t>
+      </w:r>
+      <w:r>
+        <w:t xml:space="preserve"> </w:t>
+      </w:r>
+      <w:r>
+        <w:t xml:space="preserve">contact details for correspondence rather than a work address or work phone: this is a personal project, you contract as individuals, and a contract should not route through an employer’s mailroom.</w:t>
       </w:r>
     </w:p>
     <w:p>
@@ -626,7 +585,7 @@
         <w:pStyle w:val="FirstParagraph"/>
       </w:pPr>
       <w:r>
-        <w:t xml:space="preserve">Applied evaluators are asked whether public programmes work, and they answer on a deadline with whatever data an agency can supply. This book teaches that whole job as one reproducible workflow: acquiring data from public interfaces and from agencies that publish nothing but a download button, linking administrative records that share no identifier, making a claim at the level of rigour the evidence supports, and delivering the result to a programme director, a funder, and an auditor: three readers who need the same finding at different depths. Most methods books begin once data is clean and end once a model is estimated; this one covers the eighty percent of the work on either side, in a single piece of software, with runnable code for every step.</w:t>
+        <w:t xml:space="preserve">Applied evaluators are asked whether public programmes work, and they answer on a deadline with whatever data an agency can supply. This book teaches that whole job as one reproducible workflow: acquiring data from public interfaces and from agencies that publish nothing but a download button, linking administrative records that share no identifier, making a claim at the level of rigour the evidence supports, and delivering the result to a programme director, a funder, and an auditor: three readers who need the same finding at different depths. Most methods books begin once data is clean and end once a model is estimated; this one covers the eighty percent of the work on either side, in a single piece of software, with runnable code for every step. That route has a name in the book: it extends the workflow discipline Scott Long set out for the inside of an analysis to the parts of an evaluation project Long could take as given, and five free companion Stata packages implement it.</w:t>
       </w:r>
     </w:p>
     <w:bookmarkEnd w:id="22"/>
@@ -798,13 +757,13 @@
           <w:bCs/>
           <w:b/>
         </w:rPr>
-        <w:t xml:space="preserve">Appendices:</w:t>
-      </w:r>
-      <w:r>
-        <w:t xml:space="preserve"> </w:t>
-      </w:r>
-      <w:r>
-        <w:t xml:space="preserve">A. Setup and credentials · B. Two end-to-end worked examples · C. Causal-design quick reference · D. The book’s toolkit</w:t>
+        <w:t xml:space="preserve">Appendices (five):</w:t>
+      </w:r>
+      <w:r>
+        <w:t xml:space="preserve"> </w:t>
+      </w:r>
+      <w:r>
+        <w:t xml:space="preserve">A. The setup guide (4pp) · B. The causal quick-reference toolbox (2pp) · C. The book’s toolkit (2pp) · D. Two hands-on worked examples (4pp) · E. A reproducible capstone: one public dataset, ingest to deliverable (30pp)</w:t>
       </w:r>
     </w:p>
     <w:bookmarkEnd w:id="23"/>
@@ -946,7 +905,25 @@
         <w:t xml:space="preserve"> </w:t>
       </w:r>
       <w:r>
-        <w:t xml:space="preserve">Linking administrative records with no shared identifier through cleaning, blocking, and graded string-distance scoring; handling schema drift across years; and reporting missing data rather than dropping it silently.</w:t>
+        <w:t xml:space="preserve">Linking administrative records with no shared identifier through cleaning, blocking, and graded string-distance scoring; handling schema drift across years; and reporting missing data rather than dropping it silently. The chapter closes with a capstone section, 6.6, and a full-page figure that carry the book’s whole route on one worked example: three yearly wage extracts arrive as a CSV file, an Excel file, and a Stata file, one of them silently renaming a column between years, and the section works them through to an analysis-ready panel that answers</w:t>
+      </w:r>
+      <w:r>
+        <w:t xml:space="preserve"> </w:t>
+      </w:r>
+      <w:r>
+        <w:t xml:space="preserve">“</w:t>
+      </w:r>
+      <w:r>
+        <w:t xml:space="preserve">where did this number come from?</w:t>
+      </w:r>
+      <w:r>
+        <w:t xml:space="preserve">”</w:t>
+      </w:r>
+      <w:r>
+        <w:t xml:space="preserve"> </w:t>
+      </w:r>
+      <w:r>
+        <w:t xml:space="preserve">on its own. It also teaches the loop most pipelines skip: a human reviewer reads the generated codebook, spots a wrong data vintage, corrects the metadata rather than the data, and the correction returns to the pipeline under an overwrite guard with a row-by-row receipt. Every command and every printed output in the section comes from a companion do-file that runs with assertions at each step.</w:t>
       </w:r>
     </w:p>
     <w:p>
@@ -1166,54 +1143,41 @@
           <w:bCs/>
           <w:b/>
         </w:rPr>
-        <w:t xml:space="preserve">Chapter 13,</w:t>
+        <w:t xml:space="preserve">Chapters 1, 2, 6, and 13</w:t>
+      </w:r>
+      <w:r>
+        <w:t xml:space="preserve">, ninety-two pages and about a quarter of the book. These are</w:t>
+      </w:r>
+      <w:r>
+        <w:t xml:space="preserve"> </w:t>
       </w:r>
       <w:r>
         <w:rPr>
           <w:bCs/>
           <w:b/>
         </w:rPr>
-        <w:t xml:space="preserve"> </w:t>
-      </w:r>
-      <w:r>
-        <w:rPr>
-          <w:bCs/>
-          <w:b/>
-        </w:rPr>
+        <w:t xml:space="preserve">samples of the proposed manuscript</w:t>
+      </w:r>
+      <w:r>
+        <w:t xml:space="preserve">, in final draft, not writing samples written for the proposal. Chapter 1 frames the evaluator’s role and previews the route; Chapter 2 builds the project scaffold; Chapter 6 carries the route end to end on one worked example and is the argument in miniature; Chapter 13,</w:t>
+      </w:r>
+      <w:r>
+        <w:t xml:space="preserve"> </w:t>
+      </w:r>
+      <w:r>
         <w:t xml:space="preserve">“</w:t>
       </w:r>
       <w:r>
-        <w:rPr>
-          <w:bCs/>
-          <w:b/>
-        </w:rPr>
-        <w:t xml:space="preserve">Using AI without getting burned.</w:t>
-      </w:r>
-      <w:r>
-        <w:rPr>
-          <w:bCs/>
-          <w:b/>
-        </w:rPr>
+        <w:t xml:space="preserve">Using AI without getting burned,</w:t>
+      </w:r>
+      <w:r>
         <w:t xml:space="preserve">”</w:t>
       </w:r>
       <w:r>
         <w:t xml:space="preserve"> </w:t>
       </w:r>
       <w:r>
-        <w:t xml:space="preserve">This is</w:t>
-      </w:r>
-      <w:r>
-        <w:t xml:space="preserve"> </w:t>
-      </w:r>
-      <w:r>
-        <w:rPr>
-          <w:bCs/>
-          <w:b/>
-        </w:rPr>
-        <w:t xml:space="preserve">a sample of the proposed manuscript</w:t>
-      </w:r>
-      <w:r>
-        <w:t xml:space="preserve">, in final draft, not a writing sample written for the proposal.</w:t>
+        <w:t xml:space="preserve">is the chapter with no competing title anywhere. A reviewer with time for one chapter should read Chapter 6.</w:t>
       </w:r>
     </w:p>
     <w:bookmarkEnd w:id="25"/>
@@ -1266,7 +1230,7 @@
         <w:pStyle w:val="FirstParagraph"/>
       </w:pPr>
       <w:r>
-        <w:t xml:space="preserve">Three reasons.</w:t>
+        <w:t xml:space="preserve">Four reasons.</w:t>
       </w:r>
     </w:p>
     <w:p>
@@ -1278,13 +1242,29 @@
           <w:bCs/>
           <w:b/>
         </w:rPr>
-        <w:t xml:space="preserve">It occupies a real gap.</w:t>
-      </w:r>
-      <w:r>
-        <w:t xml:space="preserve"> </w:t>
-      </w:r>
-      <w:r>
-        <w:t xml:space="preserve">Books that teach statistical software teach estimation. Books that teach evaluation practice are software-agnostic and stop before the code. Nothing covers data acquisition, analysis, and delivery as one reproducible workflow, which is what practitioners actually need and what funders increasingly require.</w:t>
+        <w:t xml:space="preserve">It is one argument rather than fifteen how-tos.</w:t>
+      </w:r>
+      <w:r>
+        <w:t xml:space="preserve"> </w:t>
+      </w:r>
+      <w:r>
+        <w:t xml:space="preserve">The book teaches a single route and names it. Scott Long’s</w:t>
+      </w:r>
+      <w:r>
+        <w:t xml:space="preserve"> </w:t>
+      </w:r>
+      <w:r>
+        <w:rPr>
+          <w:iCs/>
+          <w:i/>
+        </w:rPr>
+        <w:t xml:space="preserve">The Workflow of Data Analysis Using Stata</w:t>
+      </w:r>
+      <w:r>
+        <w:t xml:space="preserve"> </w:t>
+      </w:r>
+      <w:r>
+        <w:t xml:space="preserve">disciplined the work inside an analysis; we extend that discipline to the parts of an evaluation project Long could take as given and an evaluation shop cannot: metadata that has to survive years of merges, column names that drift between vintages, extracts that arrive with undocumented surprises, and a reviewer who has to correct the record without touching the data. Chapters 1 and 2 set the route out, Chapter 6 walks it end to end on one worked example, and Appendix E runs it again across thirty pages, carrying one public dataset from ingest to finished deliverable. Five companion Stata packages implement the route and all five are free and public: projectbuilder and combineall are already distributed through SSC, and srctag/srcfind, datadictionary, and convertanything are submitted this month. For a buyer the appeal is direct: the route answers the question in front of an analyst this week, and it leaves a pipeline they can rerun next quarter on their own data, with free tools they keep.</w:t>
       </w:r>
     </w:p>
     <w:p>
@@ -1296,13 +1276,13 @@
           <w:bCs/>
           <w:b/>
         </w:rPr>
-        <w:t xml:space="preserve">It is verifiable.</w:t>
-      </w:r>
-      <w:r>
-        <w:t xml:space="preserve"> </w:t>
-      </w:r>
-      <w:r>
-        <w:t xml:space="preserve">Every number, table, and figure printed in the book is generated by a companion do-file we can rerun on request. That is unusual in a methods book and it is the book’s own argument applied to itself: a reader can rebuild the results before trusting the text.</w:t>
+        <w:t xml:space="preserve">It occupies a real gap.</w:t>
+      </w:r>
+      <w:r>
+        <w:t xml:space="preserve"> </w:t>
+      </w:r>
+      <w:r>
+        <w:t xml:space="preserve">Books that teach statistical software teach estimation. Books that teach evaluation practice are software-agnostic and stop before the code. Nothing covers data acquisition, analysis, and delivery as one reproducible workflow, which is what practitioners actually need and what funders increasingly require.</w:t>
       </w:r>
     </w:p>
     <w:p>
@@ -1314,6 +1294,24 @@
           <w:bCs/>
           <w:b/>
         </w:rPr>
+        <w:t xml:space="preserve">It is verifiable.</w:t>
+      </w:r>
+      <w:r>
+        <w:t xml:space="preserve"> </w:t>
+      </w:r>
+      <w:r>
+        <w:t xml:space="preserve">Every number, table, and figure printed in the book is generated by a companion do-file we can rerun on request. That is unusual in a methods book and it is the book’s own argument applied to itself: a reader can rebuild the results before trusting the text.</w:t>
+      </w:r>
+    </w:p>
+    <w:p>
+      <w:pPr>
+        <w:pStyle w:val="BodyText"/>
+      </w:pPr>
+      <w:r>
+        <w:rPr>
+          <w:bCs/>
+          <w:b/>
+        </w:rPr>
         <w:t xml:space="preserve">It is current where the field is anxious.</w:t>
       </w:r>
       <w:r>
@@ -1392,7 +1390,7 @@
         <w:t xml:space="preserve"> </w:t>
       </w:r>
       <w:r>
-        <w:t xml:space="preserve">The American Evaluation Association and its international counterparts; annual Stata user-group meetings in London and the US; the authors’ own workshop teaching; and the existing user base of the authors’ published software packages, which reaches practising Stata users directly.</w:t>
+        <w:t xml:space="preserve">The American Evaluation Association and its international counterparts; annual Stata user-group meetings in London and the US; the authors’ own workshop teaching; and the users of the five free Stata packages the book teaches, two of them already distributed through SSC, which reaches practising Stata users directly.</w:t>
       </w:r>
     </w:p>
     <w:p>
@@ -1401,10 +1399,10 @@
       </w:pPr>
       <w:r>
         <w:rPr>
-          <w:bCs/>
-          <w:b/>
-        </w:rPr>
-        <w:t xml:space="preserve">[TO COMPLETE: workshop enrolment numbers and software-package download counts, as concrete evidence of demand.]</w:t>
+          <w:iCs/>
+          <w:i/>
+        </w:rPr>
+        <w:t xml:space="preserve">[Eric: if you have workshop enrolment numbers or package download counts, put them here. Concrete demand figures are the single most persuasive thing you can add for a committee that includes sales and marketing.]</w:t>
       </w:r>
     </w:p>
     <w:bookmarkEnd w:id="29"/>
@@ -1514,7 +1512,7 @@
               <w:jc w:val="left"/>
             </w:pPr>
             <w:r>
-              <w:t xml:space="preserve">Closest relative. Excellent on project discipline; predates public APIs, web deliverables, disclosure control, and AI. We build on it and say so.</w:t>
+              <w:t xml:space="preserve">Closest relative. Excellent on project discipline; predates public APIs, web deliverables, disclosure control, and AI. We extend it by name into the parts Long could take as given: metadata that survives years of merges, column names that drift between vintages, and a reviewer who corrects the record without touching the data.</w:t>
             </w:r>
           </w:p>
         </w:tc>
@@ -1884,7 +1882,7 @@
                 <w:bCs/>
                 <w:b/>
               </w:rPr>
-              <w:t xml:space="preserve">155,000</w:t>
+              <w:t xml:space="preserve">158,000</w:t>
             </w:r>
             <w:r>
               <w:t xml:space="preserve"> </w:t>
@@ -1920,7 +1918,7 @@
                 <w:bCs/>
                 <w:b/>
               </w:rPr>
-              <w:t xml:space="preserve">65 figures and 32 tables.</w:t>
+              <w:t xml:space="preserve">67 figures and 32 tables.</w:t>
             </w:r>
             <w:r>
               <w:t xml:space="preserve"> </w:t>
@@ -2194,10 +2192,10 @@
             </w:pPr>
             <w:r>
               <w:rPr>
-                <w:bCs/>
-                <w:b/>
+                <w:iCs/>
+                <w:i/>
               </w:rPr>
-              <w:t xml:space="preserve">[TO COMPLETE: list any publishers currently considering this proposal.]</w:t>
+              <w:t xml:space="preserve">[Eric: answer honestly. If Stata Press, Vernon, or Policy Press has it concurrently, say so. Simultaneous submission is normal; concealing it is what damages you.]</w:t>
             </w:r>
           </w:p>
         </w:tc>
@@ -2229,7 +2227,13 @@
           <w:bCs/>
           <w:b/>
         </w:rPr>
-        <w:t xml:space="preserve">[TO COMPLETE: name five to ten reviewers with affiliation and email, flagging which are personally known to you. Anthem prefers reviewers not personally known to the authors. Use the categories below as a guide and then delete this table.]</w:t>
+        <w:t xml:space="preserve">Left blank deliberately.</w:t>
+      </w:r>
+      <w:r>
+        <w:t xml:space="preserve"> </w:t>
+      </w:r>
+      <w:r>
+        <w:t xml:space="preserve">Anthem asks for names, affiliations, and email addresses, and wants each flagged as personally known to you or not. I will not invent real people’s contact details. Fill these five slots:</w:t>
       </w:r>
     </w:p>
     <w:tbl>
@@ -2269,19 +2273,19 @@
               <w:jc w:val="left"/>
             </w:pPr>
             <w:r>
-              <w:t xml:space="preserve">Reviewer</w:t>
-            </w:r>
-          </w:p>
-        </w:tc>
-        <w:tc>
-          <w:tcPr/>
-          <w:p>
-            <w:pPr>
-              <w:pStyle w:val="Compact"/>
-              <w:jc w:val="left"/>
-            </w:pPr>
-            <w:r>
-              <w:t xml:space="preserve">Affiliation and email</w:t>
+              <w:t xml:space="preserve">Who to look for</w:t>
+            </w:r>
+          </w:p>
+        </w:tc>
+        <w:tc>
+          <w:tcPr/>
+          <w:p>
+            <w:pPr>
+              <w:pStyle w:val="Compact"/>
+              <w:jc w:val="left"/>
+            </w:pPr>
+            <w:r>
+              <w:t xml:space="preserve">Personally known?</w:t>
             </w:r>
           </w:p>
         </w:tc>
@@ -2477,7 +2481,16 @@
         </w:tc>
       </w:tr>
     </w:tbl>
+    <w:p>
+      <w:pPr>
+        <w:pStyle w:val="BodyText"/>
+      </w:pPr>
+      <w:r>
+        <w:t xml:space="preserve">Anthem prefers reviewers not personally known to you, so weight the list that way and avoid co-authors and close collaborators.</w:t>
+      </w:r>
+    </w:p>
     <w:bookmarkEnd w:id="33"/>
+    <w:bookmarkEnd w:id="34"/>
     <w:sectPr/>
   </w:body>
 </w:document>
@@ -3191,7 +3204,7 @@
       <w:color w:themeColor="accent1" w:themeShade="BF" w:val="365F91"/>
     </w:rPr>
   </w:style>
-  <w:style w:type="paragraph" w:customStyle="1" w:styleId="SourceCode">
+  <w:style w:customStyle="1" w:styleId="SourceCode" w:type="paragraph">
     <w:name w:val="Source Code"/>
     <w:basedOn w:val="Normal"/>
     <w:link w:val="VerbatimChar"/>
@@ -3199,7 +3212,7 @@
       <w:wordWrap w:val="off"/>
     </w:pPr>
   </w:style>
-  <w:style w:type="character" w:customStyle="1" w:styleId="KeywordTok">
+  <w:style w:customStyle="1" w:styleId="KeywordTok" w:type="character">
     <w:name w:val="KeywordTok"/>
     <w:basedOn w:val="VerbatimChar"/>
     <w:rPr>
@@ -3207,77 +3220,77 @@
       <w:b/>
     </w:rPr>
   </w:style>
-  <w:style w:type="character" w:customStyle="1" w:styleId="DataTypeTok">
+  <w:style w:customStyle="1" w:styleId="DataTypeTok" w:type="character">
     <w:name w:val="DataTypeTok"/>
     <w:basedOn w:val="VerbatimChar"/>
     <w:rPr>
       <w:color w:val="902000"/>
     </w:rPr>
   </w:style>
-  <w:style w:type="character" w:customStyle="1" w:styleId="DecValTok">
+  <w:style w:customStyle="1" w:styleId="DecValTok" w:type="character">
     <w:name w:val="DecValTok"/>
     <w:basedOn w:val="VerbatimChar"/>
     <w:rPr>
       <w:color w:val="40a070"/>
     </w:rPr>
   </w:style>
-  <w:style w:type="character" w:customStyle="1" w:styleId="BaseNTok">
+  <w:style w:customStyle="1" w:styleId="BaseNTok" w:type="character">
     <w:name w:val="BaseNTok"/>
     <w:basedOn w:val="VerbatimChar"/>
     <w:rPr>
       <w:color w:val="40a070"/>
     </w:rPr>
   </w:style>
-  <w:style w:type="character" w:customStyle="1" w:styleId="FloatTok">
+  <w:style w:customStyle="1" w:styleId="FloatTok" w:type="character">
     <w:name w:val="FloatTok"/>
     <w:basedOn w:val="VerbatimChar"/>
     <w:rPr>
       <w:color w:val="40a070"/>
     </w:rPr>
   </w:style>
-  <w:style w:type="character" w:customStyle="1" w:styleId="ConstantTok">
+  <w:style w:customStyle="1" w:styleId="ConstantTok" w:type="character">
     <w:name w:val="ConstantTok"/>
     <w:basedOn w:val="VerbatimChar"/>
     <w:rPr>
       <w:color w:val="880000"/>
     </w:rPr>
   </w:style>
-  <w:style w:type="character" w:customStyle="1" w:styleId="CharTok">
+  <w:style w:customStyle="1" w:styleId="CharTok" w:type="character">
     <w:name w:val="CharTok"/>
     <w:basedOn w:val="VerbatimChar"/>
     <w:rPr>
       <w:color w:val="4070a0"/>
     </w:rPr>
   </w:style>
-  <w:style w:type="character" w:customStyle="1" w:styleId="SpecialCharTok">
+  <w:style w:customStyle="1" w:styleId="SpecialCharTok" w:type="character">
     <w:name w:val="SpecialCharTok"/>
     <w:basedOn w:val="VerbatimChar"/>
     <w:rPr>
       <w:color w:val="4070a0"/>
     </w:rPr>
   </w:style>
-  <w:style w:type="character" w:customStyle="1" w:styleId="StringTok">
+  <w:style w:customStyle="1" w:styleId="StringTok" w:type="character">
     <w:name w:val="StringTok"/>
     <w:basedOn w:val="VerbatimChar"/>
     <w:rPr>
       <w:color w:val="4070a0"/>
     </w:rPr>
   </w:style>
-  <w:style w:type="character" w:customStyle="1" w:styleId="VerbatimStringTok">
+  <w:style w:customStyle="1" w:styleId="VerbatimStringTok" w:type="character">
     <w:name w:val="VerbatimStringTok"/>
     <w:basedOn w:val="VerbatimChar"/>
     <w:rPr>
       <w:color w:val="4070a0"/>
     </w:rPr>
   </w:style>
-  <w:style w:type="character" w:customStyle="1" w:styleId="SpecialStringTok">
+  <w:style w:customStyle="1" w:styleId="SpecialStringTok" w:type="character">
     <w:name w:val="SpecialStringTok"/>
     <w:basedOn w:val="VerbatimChar"/>
     <w:rPr>
       <w:color w:val="bb6688"/>
     </w:rPr>
   </w:style>
-  <w:style w:type="character" w:customStyle="1" w:styleId="ImportTok">
+  <w:style w:customStyle="1" w:styleId="ImportTok" w:type="character">
     <w:name w:val="ImportTok"/>
     <w:basedOn w:val="VerbatimChar"/>
     <w:rPr>
@@ -3285,7 +3298,7 @@
       <w:b/>
     </w:rPr>
   </w:style>
-  <w:style w:type="character" w:customStyle="1" w:styleId="CommentTok">
+  <w:style w:customStyle="1" w:styleId="CommentTok" w:type="character">
     <w:name w:val="CommentTok"/>
     <w:basedOn w:val="VerbatimChar"/>
     <w:rPr>
@@ -3293,7 +3306,7 @@
       <w:i/>
     </w:rPr>
   </w:style>
-  <w:style w:type="character" w:customStyle="1" w:styleId="DocumentationTok">
+  <w:style w:customStyle="1" w:styleId="DocumentationTok" w:type="character">
     <w:name w:val="DocumentationTok"/>
     <w:basedOn w:val="VerbatimChar"/>
     <w:rPr>
@@ -3301,7 +3314,7 @@
       <w:i/>
     </w:rPr>
   </w:style>
-  <w:style w:type="character" w:customStyle="1" w:styleId="AnnotationTok">
+  <w:style w:customStyle="1" w:styleId="AnnotationTok" w:type="character">
     <w:name w:val="AnnotationTok"/>
     <w:basedOn w:val="VerbatimChar"/>
     <w:rPr>
@@ -3310,7 +3323,7 @@
       <w:i/>
     </w:rPr>
   </w:style>
-  <w:style w:type="character" w:customStyle="1" w:styleId="CommentVarTok">
+  <w:style w:customStyle="1" w:styleId="CommentVarTok" w:type="character">
     <w:name w:val="CommentVarTok"/>
     <w:basedOn w:val="VerbatimChar"/>
     <w:rPr>
@@ -3319,28 +3332,28 @@
       <w:i/>
     </w:rPr>
   </w:style>
-  <w:style w:type="character" w:customStyle="1" w:styleId="OtherTok">
+  <w:style w:customStyle="1" w:styleId="OtherTok" w:type="character">
     <w:name w:val="OtherTok"/>
     <w:basedOn w:val="VerbatimChar"/>
     <w:rPr>
       <w:color w:val="007020"/>
     </w:rPr>
   </w:style>
-  <w:style w:type="character" w:customStyle="1" w:styleId="FunctionTok">
+  <w:style w:customStyle="1" w:styleId="FunctionTok" w:type="character">
     <w:name w:val="FunctionTok"/>
     <w:basedOn w:val="VerbatimChar"/>
     <w:rPr>
       <w:color w:val="06287e"/>
     </w:rPr>
   </w:style>
-  <w:style w:type="character" w:customStyle="1" w:styleId="VariableTok">
+  <w:style w:customStyle="1" w:styleId="VariableTok" w:type="character">
     <w:name w:val="VariableTok"/>
     <w:basedOn w:val="VerbatimChar"/>
     <w:rPr>
       <w:color w:val="19177c"/>
     </w:rPr>
   </w:style>
-  <w:style w:type="character" w:customStyle="1" w:styleId="ControlFlowTok">
+  <w:style w:customStyle="1" w:styleId="ControlFlowTok" w:type="character">
     <w:name w:val="ControlFlowTok"/>
     <w:basedOn w:val="VerbatimChar"/>
     <w:rPr>
@@ -3348,45 +3361,45 @@
       <w:b/>
     </w:rPr>
   </w:style>
-  <w:style w:type="character" w:customStyle="1" w:styleId="OperatorTok">
+  <w:style w:customStyle="1" w:styleId="OperatorTok" w:type="character">
     <w:name w:val="OperatorTok"/>
     <w:basedOn w:val="VerbatimChar"/>
     <w:rPr>
       <w:color w:val="666666"/>
     </w:rPr>
   </w:style>
-  <w:style w:type="character" w:customStyle="1" w:styleId="BuiltInTok">
+  <w:style w:customStyle="1" w:styleId="BuiltInTok" w:type="character">
     <w:name w:val="BuiltInTok"/>
     <w:basedOn w:val="VerbatimChar"/>
     <w:rPr>
       <w:color w:val="008000"/>
     </w:rPr>
   </w:style>
-  <w:style w:type="character" w:customStyle="1" w:styleId="ExtensionTok">
+  <w:style w:customStyle="1" w:styleId="ExtensionTok" w:type="character">
     <w:name w:val="ExtensionTok"/>
     <w:basedOn w:val="VerbatimChar"/>
     <w:rPr/>
   </w:style>
-  <w:style w:type="character" w:customStyle="1" w:styleId="PreprocessorTok">
+  <w:style w:customStyle="1" w:styleId="PreprocessorTok" w:type="character">
     <w:name w:val="PreprocessorTok"/>
     <w:basedOn w:val="VerbatimChar"/>
     <w:rPr>
       <w:color w:val="bc7a00"/>
     </w:rPr>
   </w:style>
-  <w:style w:type="character" w:customStyle="1" w:styleId="AttributeTok">
+  <w:style w:customStyle="1" w:styleId="AttributeTok" w:type="character">
     <w:name w:val="AttributeTok"/>
     <w:basedOn w:val="VerbatimChar"/>
     <w:rPr>
       <w:color w:val="7d9029"/>
     </w:rPr>
   </w:style>
-  <w:style w:type="character" w:customStyle="1" w:styleId="RegionMarkerTok">
+  <w:style w:customStyle="1" w:styleId="RegionMarkerTok" w:type="character">
     <w:name w:val="RegionMarkerTok"/>
     <w:basedOn w:val="VerbatimChar"/>
     <w:rPr/>
   </w:style>
-  <w:style w:type="character" w:customStyle="1" w:styleId="InformationTok">
+  <w:style w:customStyle="1" w:styleId="InformationTok" w:type="character">
     <w:name w:val="InformationTok"/>
     <w:basedOn w:val="VerbatimChar"/>
     <w:rPr>
@@ -3395,7 +3408,7 @@
       <w:i/>
     </w:rPr>
   </w:style>
-  <w:style w:type="character" w:customStyle="1" w:styleId="WarningTok">
+  <w:style w:customStyle="1" w:styleId="WarningTok" w:type="character">
     <w:name w:val="WarningTok"/>
     <w:basedOn w:val="VerbatimChar"/>
     <w:rPr>
@@ -3404,7 +3417,7 @@
       <w:i/>
     </w:rPr>
   </w:style>
-  <w:style w:type="character" w:customStyle="1" w:styleId="AlertTok">
+  <w:style w:customStyle="1" w:styleId="AlertTok" w:type="character">
     <w:name w:val="AlertTok"/>
     <w:basedOn w:val="VerbatimChar"/>
     <w:rPr>
@@ -3412,7 +3425,7 @@
       <w:b/>
     </w:rPr>
   </w:style>
-  <w:style w:type="character" w:customStyle="1" w:styleId="ErrorTok">
+  <w:style w:customStyle="1" w:styleId="ErrorTok" w:type="character">
     <w:name w:val="ErrorTok"/>
     <w:basedOn w:val="VerbatimChar"/>
     <w:rPr>
@@ -3420,7 +3433,7 @@
       <w:b/>
     </w:rPr>
   </w:style>
-  <w:style w:type="character" w:customStyle="1" w:styleId="NormalTok">
+  <w:style w:customStyle="1" w:styleId="NormalTok" w:type="character">
     <w:name w:val="NormalTok"/>
     <w:basedOn w:val="VerbatimChar"/>
     <w:rPr/>

</xml_diff>